<commit_message>
feat(work-permits): them QR dai tu va cap nhat mau phieu
</commit_message>
<xml_diff>
--- a/templates/work-permit-mechanical.docx
+++ b/templates/work-permit-mechanical.docx
@@ -151,6 +151,9 @@
           </w:tcPr>
           <w:p>
             <w:pPr>
+              <w:tabs>
+                <w:tab w:val="left" w:pos="1587"/>
+              </w:tabs>
               <w:spacing w:after="0"/>
               <w:ind w:firstLine="0"/>
               <w:jc w:val="right"/>
@@ -193,7 +196,43 @@
                 <w:sz w:val="20"/>
                 <w:szCs w:val="20"/>
               </w:rPr>
-              <w:t xml:space="preserve"> {{soPCT}}/{{năm}}/</w:t>
+              <w:t xml:space="preserve"> {{</w:t>
+            </w:r>
+            <w:proofErr w:type="spellStart"/>
+            <w:r>
+              <w:rPr>
+                <w:color w:val="000000"/>
+                <w:sz w:val="20"/>
+                <w:szCs w:val="20"/>
+              </w:rPr>
+              <w:t>soPCT</w:t>
+            </w:r>
+            <w:proofErr w:type="spellEnd"/>
+            <w:r>
+              <w:rPr>
+                <w:color w:val="000000"/>
+                <w:sz w:val="20"/>
+                <w:szCs w:val="20"/>
+              </w:rPr>
+              <w:t>}}/{{</w:t>
+            </w:r>
+            <w:proofErr w:type="spellStart"/>
+            <w:r>
+              <w:rPr>
+                <w:color w:val="000000"/>
+                <w:sz w:val="20"/>
+                <w:szCs w:val="20"/>
+              </w:rPr>
+              <w:t>năm</w:t>
+            </w:r>
+            <w:proofErr w:type="spellEnd"/>
+            <w:r>
+              <w:rPr>
+                <w:color w:val="000000"/>
+                <w:sz w:val="20"/>
+                <w:szCs w:val="20"/>
+              </w:rPr>
+              <w:t>}}/</w:t>
             </w:r>
             <w:r>
               <w:rPr>
@@ -206,6 +245,9 @@
           </w:p>
           <w:p>
             <w:pPr>
+              <w:tabs>
+                <w:tab w:val="left" w:pos="1587"/>
+              </w:tabs>
               <w:spacing w:after="0"/>
               <w:ind w:firstLine="0"/>
               <w:jc w:val="right"/>
@@ -436,13 +478,63 @@
         </w:rPr>
         <w:t>{{</w:t>
       </w:r>
+      <w:proofErr w:type="spellStart"/>
       <w:r>
         <w:rPr>
           <w:sz w:val="24"/>
           <w:szCs w:val="24"/>
         </w:rPr>
-        <w:t>Địa điểm công tác</w:t>
+        <w:t>Địa</w:t>
       </w:r>
+      <w:proofErr w:type="spellEnd"/>
+      <w:r>
+        <w:rPr>
+          <w:sz w:val="24"/>
+          <w:szCs w:val="24"/>
+        </w:rPr>
+        <w:t xml:space="preserve"> </w:t>
+      </w:r>
+      <w:proofErr w:type="spellStart"/>
+      <w:r>
+        <w:rPr>
+          <w:sz w:val="24"/>
+          <w:szCs w:val="24"/>
+        </w:rPr>
+        <w:t>điểm</w:t>
+      </w:r>
+      <w:proofErr w:type="spellEnd"/>
+      <w:r>
+        <w:rPr>
+          <w:sz w:val="24"/>
+          <w:szCs w:val="24"/>
+        </w:rPr>
+        <w:t xml:space="preserve"> </w:t>
+      </w:r>
+      <w:proofErr w:type="spellStart"/>
+      <w:r>
+        <w:rPr>
+          <w:sz w:val="24"/>
+          <w:szCs w:val="24"/>
+        </w:rPr>
+        <w:t>công</w:t>
+      </w:r>
+      <w:proofErr w:type="spellEnd"/>
+      <w:r>
+        <w:rPr>
+          <w:sz w:val="24"/>
+          <w:szCs w:val="24"/>
+        </w:rPr>
+        <w:t xml:space="preserve"> </w:t>
+      </w:r>
+      <w:proofErr w:type="spellStart"/>
+      <w:r>
+        <w:rPr>
+          <w:sz w:val="24"/>
+          <w:szCs w:val="24"/>
+        </w:rPr>
+        <w:t>tác</w:t>
+      </w:r>
+      <w:proofErr w:type="spellEnd"/>
       <w:r>
         <w:rPr>
           <w:sz w:val="24"/>
@@ -518,7 +610,39 @@
           <w:sz w:val="24"/>
           <w:szCs w:val="24"/>
         </w:rPr>
-        <w:t>{{Phạm vi công tác}}</w:t>
+        <w:t xml:space="preserve">{{Phạm vi </w:t>
+      </w:r>
+      <w:proofErr w:type="spellStart"/>
+      <w:r>
+        <w:rPr>
+          <w:sz w:val="24"/>
+          <w:szCs w:val="24"/>
+        </w:rPr>
+        <w:t>công</w:t>
+      </w:r>
+      <w:proofErr w:type="spellEnd"/>
+      <w:r>
+        <w:rPr>
+          <w:sz w:val="24"/>
+          <w:szCs w:val="24"/>
+        </w:rPr>
+        <w:t xml:space="preserve"> </w:t>
+      </w:r>
+      <w:proofErr w:type="spellStart"/>
+      <w:r>
+        <w:rPr>
+          <w:sz w:val="24"/>
+          <w:szCs w:val="24"/>
+        </w:rPr>
+        <w:t>tác</w:t>
+      </w:r>
+      <w:proofErr w:type="spellEnd"/>
+      <w:r>
+        <w:rPr>
+          <w:sz w:val="24"/>
+          <w:szCs w:val="24"/>
+        </w:rPr>
+        <w:t>}}</w:t>
       </w:r>
     </w:p>
     <w:p>
@@ -545,7 +669,71 @@
           <w:sz w:val="24"/>
           <w:szCs w:val="24"/>
         </w:rPr>
-        <w:t>{{Dự kiến bắt đầu}}</w:t>
+        <w:t>{{</w:t>
+      </w:r>
+      <w:proofErr w:type="spellStart"/>
+      <w:r>
+        <w:rPr>
+          <w:sz w:val="24"/>
+          <w:szCs w:val="24"/>
+        </w:rPr>
+        <w:t>Dự</w:t>
+      </w:r>
+      <w:proofErr w:type="spellEnd"/>
+      <w:r>
+        <w:rPr>
+          <w:sz w:val="24"/>
+          <w:szCs w:val="24"/>
+        </w:rPr>
+        <w:t xml:space="preserve"> </w:t>
+      </w:r>
+      <w:proofErr w:type="spellStart"/>
+      <w:r>
+        <w:rPr>
+          <w:sz w:val="24"/>
+          <w:szCs w:val="24"/>
+        </w:rPr>
+        <w:t>kiến</w:t>
+      </w:r>
+      <w:proofErr w:type="spellEnd"/>
+      <w:r>
+        <w:rPr>
+          <w:sz w:val="24"/>
+          <w:szCs w:val="24"/>
+        </w:rPr>
+        <w:t xml:space="preserve"> </w:t>
+      </w:r>
+      <w:proofErr w:type="spellStart"/>
+      <w:r>
+        <w:rPr>
+          <w:sz w:val="24"/>
+          <w:szCs w:val="24"/>
+        </w:rPr>
+        <w:t>bắt</w:t>
+      </w:r>
+      <w:proofErr w:type="spellEnd"/>
+      <w:r>
+        <w:rPr>
+          <w:sz w:val="24"/>
+          <w:szCs w:val="24"/>
+        </w:rPr>
+        <w:t xml:space="preserve"> </w:t>
+      </w:r>
+      <w:proofErr w:type="spellStart"/>
+      <w:r>
+        <w:rPr>
+          <w:sz w:val="24"/>
+          <w:szCs w:val="24"/>
+        </w:rPr>
+        <w:t>đầu</w:t>
+      </w:r>
+      <w:proofErr w:type="spellEnd"/>
+      <w:r>
+        <w:rPr>
+          <w:sz w:val="24"/>
+          <w:szCs w:val="24"/>
+        </w:rPr>
+        <w:t>}}</w:t>
       </w:r>
       <w:r>
         <w:rPr>
@@ -575,14 +763,78 @@
           <w:sz w:val="24"/>
           <w:szCs w:val="24"/>
         </w:rPr>
-        <w:t>{{Dự kiến kết thúc}}</w:t>
+        <w:t>{{</w:t>
+      </w:r>
+      <w:proofErr w:type="spellStart"/>
+      <w:r>
+        <w:rPr>
+          <w:sz w:val="24"/>
+          <w:szCs w:val="24"/>
+        </w:rPr>
+        <w:t>Dự</w:t>
+      </w:r>
+      <w:proofErr w:type="spellEnd"/>
+      <w:r>
+        <w:rPr>
+          <w:sz w:val="24"/>
+          <w:szCs w:val="24"/>
+        </w:rPr>
+        <w:t xml:space="preserve"> </w:t>
+      </w:r>
+      <w:proofErr w:type="spellStart"/>
+      <w:r>
+        <w:rPr>
+          <w:sz w:val="24"/>
+          <w:szCs w:val="24"/>
+        </w:rPr>
+        <w:t>kiến</w:t>
+      </w:r>
+      <w:proofErr w:type="spellEnd"/>
+      <w:r>
+        <w:rPr>
+          <w:sz w:val="24"/>
+          <w:szCs w:val="24"/>
+        </w:rPr>
+        <w:t xml:space="preserve"> </w:t>
+      </w:r>
+      <w:proofErr w:type="spellStart"/>
+      <w:r>
+        <w:rPr>
+          <w:sz w:val="24"/>
+          <w:szCs w:val="24"/>
+        </w:rPr>
+        <w:t>kết</w:t>
+      </w:r>
+      <w:proofErr w:type="spellEnd"/>
+      <w:r>
+        <w:rPr>
+          <w:sz w:val="24"/>
+          <w:szCs w:val="24"/>
+        </w:rPr>
+        <w:t xml:space="preserve"> </w:t>
+      </w:r>
+      <w:proofErr w:type="spellStart"/>
+      <w:r>
+        <w:rPr>
+          <w:sz w:val="24"/>
+          <w:szCs w:val="24"/>
+        </w:rPr>
+        <w:t>thúc</w:t>
+      </w:r>
+      <w:proofErr w:type="spellEnd"/>
+      <w:r>
+        <w:rPr>
+          <w:sz w:val="24"/>
+          <w:szCs w:val="24"/>
+        </w:rPr>
+        <w:t>}}</w:t>
       </w:r>
     </w:p>
     <w:tbl>
       <w:tblPr>
         <w:tblStyle w:val="TableGrid"/>
-        <w:tblpPr w:leftFromText="180" w:rightFromText="180" w:vertAnchor="text" w:horzAnchor="margin" w:tblpXSpec="center" w:tblpY="-27"/>
         <w:tblW w:w="5306" w:type="pct"/>
+        <w:jc w:val="center"/>
         <w:tblLayout w:type="fixed"/>
         <w:tblLook w:val="04A0" w:firstRow="1" w:lastRow="0" w:firstColumn="1" w:lastColumn="0" w:noHBand="0" w:noVBand="1"/>
       </w:tblPr>
@@ -592,6 +844,9 @@
         <w:gridCol w:w="6372"/>
       </w:tblGrid>
       <w:tr>
+        <w:trPr>
+          <w:jc w:val="center"/>
+        </w:trPr>
         <w:tc>
           <w:tcPr>
             <w:tcW w:w="414" w:type="pct"/>
@@ -687,6 +942,7 @@
       <w:tr>
         <w:trPr>
           <w:trHeight w:val="300"/>
+          <w:jc w:val="center"/>
         </w:trPr>
         <w:tc>
           <w:tcPr>
@@ -726,7 +982,6 @@
               <w:left w:w="57" w:type="dxa"/>
               <w:right w:w="57" w:type="dxa"/>
             </w:tcMar>
-            <w:vAlign w:val="center"/>
           </w:tcPr>
           <w:p>
             <w:pPr>
@@ -745,13 +1000,38 @@
               </w:rPr>
               <w:t>{{</w:t>
             </w:r>
+            <w:proofErr w:type="spellStart"/>
             <w:r>
               <w:rPr>
                 <w:sz w:val="24"/>
                 <w:szCs w:val="24"/>
               </w:rPr>
-              <w:t>Mối nguy 1}}</w:t>
+              <w:t>Mối</w:t>
             </w:r>
+            <w:proofErr w:type="spellEnd"/>
+            <w:r>
+              <w:rPr>
+                <w:sz w:val="24"/>
+                <w:szCs w:val="24"/>
+              </w:rPr>
+              <w:t xml:space="preserve"> </w:t>
+            </w:r>
+            <w:proofErr w:type="spellStart"/>
+            <w:r>
+              <w:rPr>
+                <w:sz w:val="24"/>
+                <w:szCs w:val="24"/>
+              </w:rPr>
+              <w:t>nguy</w:t>
+            </w:r>
+            <w:proofErr w:type="spellEnd"/>
+            <w:r>
+              <w:rPr>
+                <w:sz w:val="24"/>
+                <w:szCs w:val="24"/>
+              </w:rPr>
+              <w:t xml:space="preserve"> 1}}</w:t>
+            </w:r>
           </w:p>
         </w:tc>
         <w:tc>
@@ -760,7 +1040,6 @@
             <w:tcBorders>
               <w:bottom w:val="dotted" w:sz="4" w:space="0" w:color="auto"/>
             </w:tcBorders>
-            <w:vAlign w:val="center"/>
           </w:tcPr>
           <w:p>
             <w:pPr>
@@ -777,7 +1056,55 @@
                 <w:sz w:val="24"/>
                 <w:szCs w:val="24"/>
               </w:rPr>
-              <w:t>{{Biện pháp an toàn 1}}</w:t>
+              <w:t>{{</w:t>
+            </w:r>
+            <w:proofErr w:type="spellStart"/>
+            <w:r>
+              <w:rPr>
+                <w:sz w:val="24"/>
+                <w:szCs w:val="24"/>
+              </w:rPr>
+              <w:t>Biện</w:t>
+            </w:r>
+            <w:proofErr w:type="spellEnd"/>
+            <w:r>
+              <w:rPr>
+                <w:sz w:val="24"/>
+                <w:szCs w:val="24"/>
+              </w:rPr>
+              <w:t xml:space="preserve"> </w:t>
+            </w:r>
+            <w:proofErr w:type="spellStart"/>
+            <w:r>
+              <w:rPr>
+                <w:sz w:val="24"/>
+                <w:szCs w:val="24"/>
+              </w:rPr>
+              <w:t>pháp</w:t>
+            </w:r>
+            <w:proofErr w:type="spellEnd"/>
+            <w:r>
+              <w:rPr>
+                <w:sz w:val="24"/>
+                <w:szCs w:val="24"/>
+              </w:rPr>
+              <w:t xml:space="preserve"> an </w:t>
+            </w:r>
+            <w:proofErr w:type="spellStart"/>
+            <w:r>
+              <w:rPr>
+                <w:sz w:val="24"/>
+                <w:szCs w:val="24"/>
+              </w:rPr>
+              <w:t>toàn</w:t>
+            </w:r>
+            <w:proofErr w:type="spellEnd"/>
+            <w:r>
+              <w:rPr>
+                <w:sz w:val="24"/>
+                <w:szCs w:val="24"/>
+              </w:rPr>
+              <w:t xml:space="preserve"> 1}}</w:t>
             </w:r>
           </w:p>
         </w:tc>
@@ -785,6 +1112,7 @@
       <w:tr>
         <w:trPr>
           <w:trHeight w:val="300"/>
+          <w:jc w:val="center"/>
         </w:trPr>
         <w:tc>
           <w:tcPr>
@@ -824,7 +1152,6 @@
               <w:left w:w="57" w:type="dxa"/>
               <w:right w:w="57" w:type="dxa"/>
             </w:tcMar>
-            <w:vAlign w:val="center"/>
           </w:tcPr>
           <w:p>
             <w:pPr>
@@ -842,8 +1169,40 @@
                 <w:sz w:val="24"/>
                 <w:szCs w:val="24"/>
               </w:rPr>
-              <w:t>{{Mối nguy 2}}</w:t>
+              <w:t>{{</w:t>
             </w:r>
+            <w:proofErr w:type="spellStart"/>
+            <w:r>
+              <w:rPr>
+                <w:sz w:val="24"/>
+                <w:szCs w:val="24"/>
+              </w:rPr>
+              <w:t>Mối</w:t>
+            </w:r>
+            <w:proofErr w:type="spellEnd"/>
+            <w:r>
+              <w:rPr>
+                <w:sz w:val="24"/>
+                <w:szCs w:val="24"/>
+              </w:rPr>
+              <w:t xml:space="preserve"> </w:t>
+            </w:r>
+            <w:proofErr w:type="spellStart"/>
+            <w:r>
+              <w:rPr>
+                <w:sz w:val="24"/>
+                <w:szCs w:val="24"/>
+              </w:rPr>
+              <w:t>nguy</w:t>
+            </w:r>
+            <w:proofErr w:type="spellEnd"/>
+            <w:r>
+              <w:rPr>
+                <w:sz w:val="24"/>
+                <w:szCs w:val="24"/>
+              </w:rPr>
+              <w:t xml:space="preserve"> 2}}</w:t>
+            </w:r>
           </w:p>
         </w:tc>
         <w:tc>
@@ -852,7 +1211,6 @@
             <w:tcBorders>
               <w:bottom w:val="dotted" w:sz="4" w:space="0" w:color="auto"/>
             </w:tcBorders>
-            <w:vAlign w:val="center"/>
           </w:tcPr>
           <w:p>
             <w:pPr>
@@ -870,7 +1228,55 @@
                 <w:sz w:val="24"/>
                 <w:szCs w:val="24"/>
               </w:rPr>
-              <w:t>{{Biện pháp an toàn 2}}</w:t>
+              <w:t>{{</w:t>
+            </w:r>
+            <w:proofErr w:type="spellStart"/>
+            <w:r>
+              <w:rPr>
+                <w:sz w:val="24"/>
+                <w:szCs w:val="24"/>
+              </w:rPr>
+              <w:t>Biện</w:t>
+            </w:r>
+            <w:proofErr w:type="spellEnd"/>
+            <w:r>
+              <w:rPr>
+                <w:sz w:val="24"/>
+                <w:szCs w:val="24"/>
+              </w:rPr>
+              <w:t xml:space="preserve"> </w:t>
+            </w:r>
+            <w:proofErr w:type="spellStart"/>
+            <w:r>
+              <w:rPr>
+                <w:sz w:val="24"/>
+                <w:szCs w:val="24"/>
+              </w:rPr>
+              <w:t>pháp</w:t>
+            </w:r>
+            <w:proofErr w:type="spellEnd"/>
+            <w:r>
+              <w:rPr>
+                <w:sz w:val="24"/>
+                <w:szCs w:val="24"/>
+              </w:rPr>
+              <w:t xml:space="preserve"> an </w:t>
+            </w:r>
+            <w:proofErr w:type="spellStart"/>
+            <w:r>
+              <w:rPr>
+                <w:sz w:val="24"/>
+                <w:szCs w:val="24"/>
+              </w:rPr>
+              <w:t>toàn</w:t>
+            </w:r>
+            <w:proofErr w:type="spellEnd"/>
+            <w:r>
+              <w:rPr>
+                <w:sz w:val="24"/>
+                <w:szCs w:val="24"/>
+              </w:rPr>
+              <w:t xml:space="preserve"> 2}}</w:t>
             </w:r>
           </w:p>
         </w:tc>
@@ -878,6 +1284,7 @@
       <w:tr>
         <w:trPr>
           <w:trHeight w:val="300"/>
+          <w:jc w:val="center"/>
         </w:trPr>
         <w:tc>
           <w:tcPr>
@@ -917,7 +1324,6 @@
               <w:left w:w="57" w:type="dxa"/>
               <w:right w:w="57" w:type="dxa"/>
             </w:tcMar>
-            <w:vAlign w:val="center"/>
           </w:tcPr>
           <w:p>
             <w:pPr>
@@ -935,8 +1341,40 @@
                 <w:sz w:val="24"/>
                 <w:szCs w:val="24"/>
               </w:rPr>
-              <w:t>{{Mối nguy 3}}</w:t>
+              <w:t>{{</w:t>
             </w:r>
+            <w:proofErr w:type="spellStart"/>
+            <w:r>
+              <w:rPr>
+                <w:sz w:val="24"/>
+                <w:szCs w:val="24"/>
+              </w:rPr>
+              <w:t>Mối</w:t>
+            </w:r>
+            <w:proofErr w:type="spellEnd"/>
+            <w:r>
+              <w:rPr>
+                <w:sz w:val="24"/>
+                <w:szCs w:val="24"/>
+              </w:rPr>
+              <w:t xml:space="preserve"> </w:t>
+            </w:r>
+            <w:proofErr w:type="spellStart"/>
+            <w:r>
+              <w:rPr>
+                <w:sz w:val="24"/>
+                <w:szCs w:val="24"/>
+              </w:rPr>
+              <w:t>nguy</w:t>
+            </w:r>
+            <w:proofErr w:type="spellEnd"/>
+            <w:r>
+              <w:rPr>
+                <w:sz w:val="24"/>
+                <w:szCs w:val="24"/>
+              </w:rPr>
+              <w:t xml:space="preserve"> 3}}</w:t>
+            </w:r>
           </w:p>
         </w:tc>
         <w:tc>
@@ -945,7 +1383,6 @@
             <w:tcBorders>
               <w:bottom w:val="dotted" w:sz="4" w:space="0" w:color="auto"/>
             </w:tcBorders>
-            <w:vAlign w:val="center"/>
           </w:tcPr>
           <w:p>
             <w:pPr>
@@ -963,7 +1400,55 @@
                 <w:sz w:val="24"/>
                 <w:szCs w:val="24"/>
               </w:rPr>
-              <w:t>{{Biện pháp an toàn 3}}</w:t>
+              <w:t>{{</w:t>
+            </w:r>
+            <w:proofErr w:type="spellStart"/>
+            <w:r>
+              <w:rPr>
+                <w:sz w:val="24"/>
+                <w:szCs w:val="24"/>
+              </w:rPr>
+              <w:t>Biện</w:t>
+            </w:r>
+            <w:proofErr w:type="spellEnd"/>
+            <w:r>
+              <w:rPr>
+                <w:sz w:val="24"/>
+                <w:szCs w:val="24"/>
+              </w:rPr>
+              <w:t xml:space="preserve"> </w:t>
+            </w:r>
+            <w:proofErr w:type="spellStart"/>
+            <w:r>
+              <w:rPr>
+                <w:sz w:val="24"/>
+                <w:szCs w:val="24"/>
+              </w:rPr>
+              <w:t>pháp</w:t>
+            </w:r>
+            <w:proofErr w:type="spellEnd"/>
+            <w:r>
+              <w:rPr>
+                <w:sz w:val="24"/>
+                <w:szCs w:val="24"/>
+              </w:rPr>
+              <w:t xml:space="preserve"> an </w:t>
+            </w:r>
+            <w:proofErr w:type="spellStart"/>
+            <w:r>
+              <w:rPr>
+                <w:sz w:val="24"/>
+                <w:szCs w:val="24"/>
+              </w:rPr>
+              <w:t>toàn</w:t>
+            </w:r>
+            <w:proofErr w:type="spellEnd"/>
+            <w:r>
+              <w:rPr>
+                <w:sz w:val="24"/>
+                <w:szCs w:val="24"/>
+              </w:rPr>
+              <w:t xml:space="preserve"> 3}}</w:t>
             </w:r>
           </w:p>
         </w:tc>
@@ -971,6 +1456,7 @@
       <w:tr>
         <w:trPr>
           <w:trHeight w:val="300"/>
+          <w:jc w:val="center"/>
         </w:trPr>
         <w:tc>
           <w:tcPr>
@@ -1010,7 +1496,6 @@
               <w:left w:w="57" w:type="dxa"/>
               <w:right w:w="57" w:type="dxa"/>
             </w:tcMar>
-            <w:vAlign w:val="center"/>
           </w:tcPr>
           <w:p>
             <w:pPr>
@@ -1037,7 +1522,6 @@
             <w:tcBorders>
               <w:bottom w:val="dotted" w:sz="4" w:space="0" w:color="auto"/>
             </w:tcBorders>
-            <w:vAlign w:val="center"/>
           </w:tcPr>
           <w:p>
             <w:pPr>
@@ -1062,6 +1546,7 @@
       <w:tr>
         <w:trPr>
           <w:trHeight w:val="300"/>
+          <w:jc w:val="center"/>
         </w:trPr>
         <w:tc>
           <w:tcPr>
@@ -1101,7 +1586,6 @@
               <w:left w:w="57" w:type="dxa"/>
               <w:right w:w="57" w:type="dxa"/>
             </w:tcMar>
-            <w:vAlign w:val="center"/>
           </w:tcPr>
           <w:p>
             <w:pPr>
@@ -1119,8 +1603,40 @@
                 <w:sz w:val="24"/>
                 <w:szCs w:val="24"/>
               </w:rPr>
-              <w:t>{{Mối nguy n}}</w:t>
+              <w:t>{{</w:t>
             </w:r>
+            <w:proofErr w:type="spellStart"/>
+            <w:r>
+              <w:rPr>
+                <w:sz w:val="24"/>
+                <w:szCs w:val="24"/>
+              </w:rPr>
+              <w:t>Mối</w:t>
+            </w:r>
+            <w:proofErr w:type="spellEnd"/>
+            <w:r>
+              <w:rPr>
+                <w:sz w:val="24"/>
+                <w:szCs w:val="24"/>
+              </w:rPr>
+              <w:t xml:space="preserve"> </w:t>
+            </w:r>
+            <w:proofErr w:type="spellStart"/>
+            <w:r>
+              <w:rPr>
+                <w:sz w:val="24"/>
+                <w:szCs w:val="24"/>
+              </w:rPr>
+              <w:t>nguy</w:t>
+            </w:r>
+            <w:proofErr w:type="spellEnd"/>
+            <w:r>
+              <w:rPr>
+                <w:sz w:val="24"/>
+                <w:szCs w:val="24"/>
+              </w:rPr>
+              <w:t xml:space="preserve"> n}}</w:t>
+            </w:r>
           </w:p>
         </w:tc>
         <w:tc>
@@ -1129,7 +1645,6 @@
             <w:tcBorders>
               <w:bottom w:val="dotted" w:sz="4" w:space="0" w:color="auto"/>
             </w:tcBorders>
-            <w:vAlign w:val="center"/>
           </w:tcPr>
           <w:p>
             <w:pPr>
@@ -1147,12 +1662,63 @@
                 <w:sz w:val="24"/>
                 <w:szCs w:val="24"/>
               </w:rPr>
-              <w:t>{{Biện pháp an toàn n}}</w:t>
+              <w:t>{{</w:t>
+            </w:r>
+            <w:proofErr w:type="spellStart"/>
+            <w:r>
+              <w:rPr>
+                <w:sz w:val="24"/>
+                <w:szCs w:val="24"/>
+              </w:rPr>
+              <w:t>Biện</w:t>
+            </w:r>
+            <w:proofErr w:type="spellEnd"/>
+            <w:r>
+              <w:rPr>
+                <w:sz w:val="24"/>
+                <w:szCs w:val="24"/>
+              </w:rPr>
+              <w:t xml:space="preserve"> </w:t>
+            </w:r>
+            <w:proofErr w:type="spellStart"/>
+            <w:r>
+              <w:rPr>
+                <w:sz w:val="24"/>
+                <w:szCs w:val="24"/>
+              </w:rPr>
+              <w:t>pháp</w:t>
+            </w:r>
+            <w:proofErr w:type="spellEnd"/>
+            <w:r>
+              <w:rPr>
+                <w:sz w:val="24"/>
+                <w:szCs w:val="24"/>
+              </w:rPr>
+              <w:t xml:space="preserve"> an </w:t>
+            </w:r>
+            <w:proofErr w:type="spellStart"/>
+            <w:r>
+              <w:rPr>
+                <w:sz w:val="24"/>
+                <w:szCs w:val="24"/>
+              </w:rPr>
+              <w:t>toàn</w:t>
+            </w:r>
+            <w:proofErr w:type="spellEnd"/>
+            <w:r>
+              <w:rPr>
+                <w:sz w:val="24"/>
+                <w:szCs w:val="24"/>
+              </w:rPr>
+              <w:t xml:space="preserve"> n}}</w:t>
             </w:r>
           </w:p>
         </w:tc>
       </w:tr>
       <w:tr>
+        <w:trPr>
+          <w:jc w:val="center"/>
+        </w:trPr>
         <w:tc>
           <w:tcPr>
             <w:tcW w:w="414" w:type="pct"/>
@@ -1193,7 +1759,6 @@
               <w:left w:w="57" w:type="dxa"/>
               <w:right w:w="57" w:type="dxa"/>
             </w:tcMar>
-            <w:vAlign w:val="center"/>
           </w:tcPr>
           <w:p>
             <w:pPr>
@@ -1215,7 +1780,6 @@
               <w:top w:val="dotted" w:sz="4" w:space="0" w:color="auto"/>
               <w:bottom w:val="dotted" w:sz="4" w:space="0" w:color="auto"/>
             </w:tcBorders>
-            <w:vAlign w:val="center"/>
           </w:tcPr>
           <w:p>
             <w:pPr>
@@ -1232,6 +1796,9 @@
         </w:tc>
       </w:tr>
       <w:tr>
+        <w:trPr>
+          <w:jc w:val="center"/>
+        </w:trPr>
         <w:tc>
           <w:tcPr>
             <w:tcW w:w="414" w:type="pct"/>
@@ -1270,7 +1837,6 @@
               <w:left w:w="57" w:type="dxa"/>
               <w:right w:w="57" w:type="dxa"/>
             </w:tcMar>
-            <w:vAlign w:val="center"/>
           </w:tcPr>
           <w:p>
             <w:pPr>
@@ -1291,7 +1857,6 @@
               <w:top w:val="dotted" w:sz="4" w:space="0" w:color="auto"/>
               <w:bottom w:val="dotted" w:sz="4" w:space="0" w:color="auto"/>
             </w:tcBorders>
-            <w:vAlign w:val="center"/>
           </w:tcPr>
           <w:p>
             <w:pPr>
@@ -1307,6 +1872,9 @@
         </w:tc>
       </w:tr>
       <w:tr>
+        <w:trPr>
+          <w:jc w:val="center"/>
+        </w:trPr>
         <w:tc>
           <w:tcPr>
             <w:tcW w:w="414" w:type="pct"/>
@@ -1345,7 +1913,6 @@
               <w:left w:w="57" w:type="dxa"/>
               <w:right w:w="57" w:type="dxa"/>
             </w:tcMar>
-            <w:vAlign w:val="center"/>
           </w:tcPr>
           <w:p>
             <w:pPr>
@@ -1366,7 +1933,6 @@
               <w:top w:val="dotted" w:sz="4" w:space="0" w:color="auto"/>
               <w:bottom w:val="dotted" w:sz="4" w:space="0" w:color="auto"/>
             </w:tcBorders>
-            <w:vAlign w:val="center"/>
           </w:tcPr>
           <w:p>
             <w:pPr>
@@ -1406,7 +1972,39 @@
           <w:sz w:val="24"/>
           <w:szCs w:val="24"/>
         </w:rPr>
-        <w:t xml:space="preserve"> {{Người cấp phiếu}}.</w:t>
+        <w:t xml:space="preserve"> {{Người </w:t>
+      </w:r>
+      <w:proofErr w:type="spellStart"/>
+      <w:r>
+        <w:rPr>
+          <w:sz w:val="24"/>
+          <w:szCs w:val="24"/>
+        </w:rPr>
+        <w:t>cấp</w:t>
+      </w:r>
+      <w:proofErr w:type="spellEnd"/>
+      <w:r>
+        <w:rPr>
+          <w:sz w:val="24"/>
+          <w:szCs w:val="24"/>
+        </w:rPr>
+        <w:t xml:space="preserve"> </w:t>
+      </w:r>
+      <w:proofErr w:type="spellStart"/>
+      <w:r>
+        <w:rPr>
+          <w:sz w:val="24"/>
+          <w:szCs w:val="24"/>
+        </w:rPr>
+        <w:t>phiếu</w:t>
+      </w:r>
+      <w:proofErr w:type="spellEnd"/>
+      <w:r>
+        <w:rPr>
+          <w:sz w:val="24"/>
+          <w:szCs w:val="24"/>
+        </w:rPr>
+        <w:t>}}.</w:t>
       </w:r>
       <w:r>
         <w:rPr>
@@ -1445,7 +2043,23 @@
           <w:sz w:val="24"/>
           <w:szCs w:val="24"/>
         </w:rPr>
-        <w:t xml:space="preserve">: {{dateCurrent}}. </w:t>
+        <w:t>: {{</w:t>
+      </w:r>
+      <w:proofErr w:type="spellStart"/>
+      <w:r>
+        <w:rPr>
+          <w:sz w:val="24"/>
+          <w:szCs w:val="24"/>
+        </w:rPr>
+        <w:t>dateCurrent</w:t>
+      </w:r>
+      <w:proofErr w:type="spellEnd"/>
+      <w:r>
+        <w:rPr>
+          <w:sz w:val="24"/>
+          <w:szCs w:val="24"/>
+        </w:rPr>
+        <w:t xml:space="preserve">}}. </w:t>
       </w:r>
       <w:r>
         <w:rPr>
@@ -1507,8 +2121,8 @@
     <w:tbl>
       <w:tblPr>
         <w:tblStyle w:val="TableGrid"/>
-        <w:tblpPr w:leftFromText="180" w:rightFromText="180" w:vertAnchor="text" w:horzAnchor="margin" w:tblpXSpec="center" w:tblpY="84"/>
         <w:tblW w:w="5165" w:type="pct"/>
+        <w:jc w:val="center"/>
         <w:tblLayout w:type="fixed"/>
         <w:tblLook w:val="04A0" w:firstRow="1" w:lastRow="0" w:firstColumn="1" w:lastColumn="0" w:noHBand="0" w:noVBand="1"/>
       </w:tblPr>
@@ -1519,6 +2133,9 @@
         <w:gridCol w:w="1106"/>
       </w:tblGrid>
       <w:tr>
+        <w:trPr>
+          <w:jc w:val="center"/>
+        </w:trPr>
         <w:tc>
           <w:tcPr>
             <w:tcW w:w="354" w:type="pct"/>
@@ -1642,6 +2259,9 @@
         </w:tc>
       </w:tr>
       <w:tr>
+        <w:trPr>
+          <w:jc w:val="center"/>
+        </w:trPr>
         <w:tc>
           <w:tcPr>
             <w:tcW w:w="354" w:type="pct"/>
@@ -1680,7 +2300,6 @@
               <w:left w:w="57" w:type="dxa"/>
               <w:right w:w="57" w:type="dxa"/>
             </w:tcMar>
-            <w:vAlign w:val="center"/>
           </w:tcPr>
           <w:p>
             <w:pPr>
@@ -1704,7 +2323,6 @@
               <w:left w:w="57" w:type="dxa"/>
               <w:right w:w="57" w:type="dxa"/>
             </w:tcMar>
-            <w:vAlign w:val="center"/>
           </w:tcPr>
           <w:p>
             <w:pPr>
@@ -1724,7 +2342,6 @@
             <w:tcBorders>
               <w:bottom w:val="dotted" w:sz="4" w:space="0" w:color="auto"/>
             </w:tcBorders>
-            <w:vAlign w:val="center"/>
           </w:tcPr>
           <w:p>
             <w:pPr>
@@ -1740,6 +2357,9 @@
         </w:tc>
       </w:tr>
       <w:tr>
+        <w:trPr>
+          <w:jc w:val="center"/>
+        </w:trPr>
         <w:tc>
           <w:tcPr>
             <w:tcW w:w="354" w:type="pct"/>
@@ -1777,7 +2397,6 @@
               <w:left w:w="57" w:type="dxa"/>
               <w:right w:w="57" w:type="dxa"/>
             </w:tcMar>
-            <w:vAlign w:val="center"/>
           </w:tcPr>
           <w:p>
             <w:pPr>
@@ -1801,7 +2420,6 @@
               <w:left w:w="57" w:type="dxa"/>
               <w:right w:w="57" w:type="dxa"/>
             </w:tcMar>
-            <w:vAlign w:val="center"/>
           </w:tcPr>
           <w:p>
             <w:pPr>
@@ -1821,7 +2439,6 @@
             <w:tcBorders>
               <w:bottom w:val="dotted" w:sz="4" w:space="0" w:color="auto"/>
             </w:tcBorders>
-            <w:vAlign w:val="center"/>
           </w:tcPr>
           <w:p>
             <w:pPr>
@@ -1837,6 +2454,9 @@
         </w:tc>
       </w:tr>
       <w:tr>
+        <w:trPr>
+          <w:jc w:val="center"/>
+        </w:trPr>
         <w:tc>
           <w:tcPr>
             <w:tcW w:w="354" w:type="pct"/>
@@ -1874,7 +2494,6 @@
               <w:left w:w="57" w:type="dxa"/>
               <w:right w:w="57" w:type="dxa"/>
             </w:tcMar>
-            <w:vAlign w:val="center"/>
           </w:tcPr>
           <w:p>
             <w:pPr>
@@ -1899,7 +2518,6 @@
               <w:left w:w="57" w:type="dxa"/>
               <w:right w:w="57" w:type="dxa"/>
             </w:tcMar>
-            <w:vAlign w:val="center"/>
           </w:tcPr>
           <w:p>
             <w:pPr>
@@ -1918,7 +2536,6 @@
             <w:tcBorders>
               <w:bottom w:val="single" w:sz="4" w:space="0" w:color="auto"/>
             </w:tcBorders>
-            <w:vAlign w:val="center"/>
           </w:tcPr>
           <w:p>
             <w:pPr>
@@ -1933,6 +2550,9 @@
         </w:tc>
       </w:tr>
       <w:tr>
+        <w:trPr>
+          <w:jc w:val="center"/>
+        </w:trPr>
         <w:tc>
           <w:tcPr>
             <w:tcW w:w="354" w:type="pct"/>
@@ -1970,7 +2590,6 @@
               <w:left w:w="57" w:type="dxa"/>
               <w:right w:w="57" w:type="dxa"/>
             </w:tcMar>
-            <w:vAlign w:val="center"/>
           </w:tcPr>
           <w:p>
             <w:pPr>
@@ -1995,7 +2614,6 @@
               <w:left w:w="57" w:type="dxa"/>
               <w:right w:w="57" w:type="dxa"/>
             </w:tcMar>
-            <w:vAlign w:val="center"/>
           </w:tcPr>
           <w:p>
             <w:pPr>
@@ -2014,7 +2632,6 @@
             <w:tcBorders>
               <w:bottom w:val="single" w:sz="4" w:space="0" w:color="auto"/>
             </w:tcBorders>
-            <w:vAlign w:val="center"/>
           </w:tcPr>
           <w:p>
             <w:pPr>
@@ -2029,6 +2646,9 @@
         </w:tc>
       </w:tr>
       <w:tr>
+        <w:trPr>
+          <w:jc w:val="center"/>
+        </w:trPr>
         <w:tc>
           <w:tcPr>
             <w:tcW w:w="354" w:type="pct"/>
@@ -2068,7 +2688,6 @@
               <w:left w:w="57" w:type="dxa"/>
               <w:right w:w="57" w:type="dxa"/>
             </w:tcMar>
-            <w:vAlign w:val="center"/>
           </w:tcPr>
           <w:p>
             <w:pPr>
@@ -2093,7 +2712,6 @@
               <w:left w:w="57" w:type="dxa"/>
               <w:right w:w="57" w:type="dxa"/>
             </w:tcMar>
-            <w:vAlign w:val="center"/>
           </w:tcPr>
           <w:p>
             <w:pPr>
@@ -2114,7 +2732,6 @@
               <w:top w:val="single" w:sz="4" w:space="0" w:color="auto"/>
               <w:bottom w:val="single" w:sz="4" w:space="0" w:color="auto"/>
             </w:tcBorders>
-            <w:vAlign w:val="center"/>
           </w:tcPr>
           <w:p>
             <w:pPr>
@@ -2130,6 +2747,9 @@
         </w:tc>
       </w:tr>
       <w:tr>
+        <w:trPr>
+          <w:jc w:val="center"/>
+        </w:trPr>
         <w:tc>
           <w:tcPr>
             <w:tcW w:w="354" w:type="pct"/>
@@ -2169,7 +2789,6 @@
               <w:left w:w="57" w:type="dxa"/>
               <w:right w:w="57" w:type="dxa"/>
             </w:tcMar>
-            <w:vAlign w:val="center"/>
           </w:tcPr>
           <w:p>
             <w:pPr>
@@ -2194,7 +2813,6 @@
               <w:left w:w="57" w:type="dxa"/>
               <w:right w:w="57" w:type="dxa"/>
             </w:tcMar>
-            <w:vAlign w:val="center"/>
           </w:tcPr>
           <w:p>
             <w:pPr>
@@ -2215,7 +2833,6 @@
               <w:top w:val="single" w:sz="4" w:space="0" w:color="auto"/>
               <w:bottom w:val="single" w:sz="4" w:space="0" w:color="auto"/>
             </w:tcBorders>
-            <w:vAlign w:val="center"/>
           </w:tcPr>
           <w:p>
             <w:pPr>
@@ -2231,6 +2848,9 @@
         </w:tc>
       </w:tr>
       <w:tr>
+        <w:trPr>
+          <w:jc w:val="center"/>
+        </w:trPr>
         <w:tc>
           <w:tcPr>
             <w:tcW w:w="354" w:type="pct"/>
@@ -2269,7 +2889,6 @@
               <w:left w:w="57" w:type="dxa"/>
               <w:right w:w="57" w:type="dxa"/>
             </w:tcMar>
-            <w:vAlign w:val="center"/>
           </w:tcPr>
           <w:p>
             <w:pPr>
@@ -2294,7 +2913,6 @@
               <w:left w:w="57" w:type="dxa"/>
               <w:right w:w="57" w:type="dxa"/>
             </w:tcMar>
-            <w:vAlign w:val="center"/>
           </w:tcPr>
           <w:p>
             <w:pPr>
@@ -2315,7 +2933,6 @@
               <w:top w:val="single" w:sz="4" w:space="0" w:color="auto"/>
               <w:bottom w:val="single" w:sz="4" w:space="0" w:color="auto"/>
             </w:tcBorders>
-            <w:vAlign w:val="center"/>
           </w:tcPr>
           <w:p>
             <w:pPr>
@@ -2331,6 +2948,9 @@
         </w:tc>
       </w:tr>
       <w:tr>
+        <w:trPr>
+          <w:jc w:val="center"/>
+        </w:trPr>
         <w:tc>
           <w:tcPr>
             <w:tcW w:w="354" w:type="pct"/>
@@ -2369,7 +2989,6 @@
               <w:left w:w="57" w:type="dxa"/>
               <w:right w:w="57" w:type="dxa"/>
             </w:tcMar>
-            <w:vAlign w:val="center"/>
           </w:tcPr>
           <w:p>
             <w:pPr>
@@ -2395,7 +3014,6 @@
               <w:left w:w="57" w:type="dxa"/>
               <w:right w:w="57" w:type="dxa"/>
             </w:tcMar>
-            <w:vAlign w:val="center"/>
           </w:tcPr>
           <w:p>
             <w:pPr>
@@ -2416,7 +3034,6 @@
               <w:top w:val="single" w:sz="4" w:space="0" w:color="auto"/>
               <w:bottom w:val="single" w:sz="4" w:space="0" w:color="auto"/>
             </w:tcBorders>
-            <w:vAlign w:val="center"/>
           </w:tcPr>
           <w:p>
             <w:pPr>
@@ -2440,7 +3057,6 @@
         <w:rPr>
           <w:sz w:val="24"/>
           <w:szCs w:val="24"/>
-          <w:lang w:val="vi-VN"/>
         </w:rPr>
       </w:pPr>
       <w:r>
@@ -2464,9 +3080,8 @@
           <w:sz w:val="24"/>
           <w:szCs w:val="24"/>
         </w:rPr>
-        <w:tab/>
+        <w:t>.</w:t>
       </w:r>
-      <w:proofErr w:type="gramStart"/>
       <w:r>
         <w:rPr>
           <w:sz w:val="24"/>
@@ -2480,23 +3095,30 @@
           <w:szCs w:val="24"/>
           <w:lang w:val="vi-VN"/>
         </w:rPr>
-        <w:t>Chữ</w:t>
-      </w:r>
-      <w:proofErr w:type="gramEnd"/>
-      <w:r>
-        <w:rPr>
-          <w:sz w:val="24"/>
-          <w:szCs w:val="24"/>
-          <w:lang w:val="vi-VN"/>
-        </w:rPr>
-        <w:t xml:space="preserve"> ký ……………. Ngày</w:t>
+        <w:t>Chữ ký ……………. Ngày</w:t>
       </w:r>
       <w:r>
         <w:rPr>
           <w:sz w:val="24"/>
           <w:szCs w:val="24"/>
         </w:rPr>
-        <w:t xml:space="preserve">: {{dateCurrent}}. </w:t>
+        <w:t>: {{</w:t>
+      </w:r>
+      <w:proofErr w:type="spellStart"/>
+      <w:r>
+        <w:rPr>
+          <w:sz w:val="24"/>
+          <w:szCs w:val="24"/>
+        </w:rPr>
+        <w:t>dateCurrent</w:t>
+      </w:r>
+      <w:proofErr w:type="spellEnd"/>
+      <w:r>
+        <w:rPr>
+          <w:sz w:val="24"/>
+          <w:szCs w:val="24"/>
+        </w:rPr>
+        <w:t xml:space="preserve">}}. </w:t>
       </w:r>
       <w:r>
         <w:rPr>
@@ -2520,6 +3142,13 @@
           <w:lang w:val="vi-VN"/>
         </w:rPr>
         <w:t>…..</w:t>
+      </w:r>
+      <w:r>
+        <w:rPr>
+          <w:sz w:val="24"/>
+          <w:szCs w:val="24"/>
+        </w:rPr>
+        <w:t>.</w:t>
       </w:r>
     </w:p>
     <w:p>
@@ -2568,15 +3197,7 @@
           <w:sz w:val="24"/>
           <w:szCs w:val="24"/>
         </w:rPr>
-        <w:tab/>
-      </w:r>
-      <w:proofErr w:type="gramStart"/>
-      <w:r>
-        <w:rPr>
-          <w:sz w:val="24"/>
-          <w:szCs w:val="24"/>
-        </w:rPr>
-        <w:t>.</w:t>
+        <w:t>….</w:t>
       </w:r>
       <w:r>
         <w:rPr>
@@ -2584,16 +3205,7 @@
           <w:szCs w:val="24"/>
           <w:lang w:val="vi-VN"/>
         </w:rPr>
-        <w:t>Chữ</w:t>
-      </w:r>
-      <w:proofErr w:type="gramEnd"/>
-      <w:r>
-        <w:rPr>
-          <w:sz w:val="24"/>
-          <w:szCs w:val="24"/>
-          <w:lang w:val="vi-VN"/>
-        </w:rPr>
-        <w:t xml:space="preserve"> ký …………</w:t>
+        <w:t>Chữ ký …………</w:t>
       </w:r>
       <w:r>
         <w:rPr>
@@ -2615,7 +3227,23 @@
           <w:sz w:val="24"/>
           <w:szCs w:val="24"/>
         </w:rPr>
-        <w:t xml:space="preserve">: {{dateCurrent}}. </w:t>
+        <w:t>: {{</w:t>
+      </w:r>
+      <w:proofErr w:type="spellStart"/>
+      <w:r>
+        <w:rPr>
+          <w:sz w:val="24"/>
+          <w:szCs w:val="24"/>
+        </w:rPr>
+        <w:t>dateCurrent</w:t>
+      </w:r>
+      <w:proofErr w:type="spellEnd"/>
+      <w:r>
+        <w:rPr>
+          <w:sz w:val="24"/>
+          <w:szCs w:val="24"/>
+        </w:rPr>
+        <w:t xml:space="preserve">}}. </w:t>
       </w:r>
       <w:r>
         <w:rPr>
@@ -2638,7 +3266,14 @@
           <w:szCs w:val="24"/>
           <w:lang w:val="vi-VN"/>
         </w:rPr>
-        <w:t>…..</w:t>
+        <w:t>…</w:t>
+      </w:r>
+      <w:r>
+        <w:rPr>
+          <w:sz w:val="24"/>
+          <w:szCs w:val="24"/>
+        </w:rPr>
+        <w:t>...</w:t>
       </w:r>
     </w:p>
     <w:p>
@@ -2969,7 +3604,6 @@
                 <w:szCs w:val="24"/>
                 <w:lang w:val="vi-VN"/>
               </w:rPr>
-              <w:lastRenderedPageBreak/>
               <w:t>2</w:t>
             </w:r>
           </w:p>
@@ -3079,6 +3713,7 @@
                 <w:szCs w:val="24"/>
                 <w:lang w:val="vi-VN"/>
               </w:rPr>
+              <w:lastRenderedPageBreak/>
               <w:t>3</w:t>
             </w:r>
           </w:p>
@@ -4396,6 +5031,152 @@
                 <w:szCs w:val="24"/>
               </w:rPr>
             </w:pPr>
+            <w:proofErr w:type="spellStart"/>
+            <w:r>
+              <w:rPr>
+                <w:rFonts w:cs="Times New Roman"/>
+                <w:b/>
+                <w:bCs/>
+                <w:sz w:val="24"/>
+                <w:szCs w:val="24"/>
+              </w:rPr>
+              <w:t>Vị</w:t>
+            </w:r>
+            <w:proofErr w:type="spellEnd"/>
+            <w:r>
+              <w:rPr>
+                <w:rFonts w:cs="Times New Roman"/>
+                <w:b/>
+                <w:bCs/>
+                <w:sz w:val="24"/>
+                <w:szCs w:val="24"/>
+              </w:rPr>
+              <w:t xml:space="preserve"> </w:t>
+            </w:r>
+            <w:proofErr w:type="spellStart"/>
+            <w:proofErr w:type="gramStart"/>
+            <w:r>
+              <w:rPr>
+                <w:rFonts w:cs="Times New Roman"/>
+                <w:b/>
+                <w:bCs/>
+                <w:sz w:val="24"/>
+                <w:szCs w:val="24"/>
+              </w:rPr>
+              <w:t>trí</w:t>
+            </w:r>
+            <w:proofErr w:type="spellEnd"/>
+            <w:r>
+              <w:rPr>
+                <w:rFonts w:cs="Times New Roman"/>
+                <w:b/>
+                <w:bCs/>
+                <w:sz w:val="24"/>
+                <w:szCs w:val="24"/>
+              </w:rPr>
+              <w:t>:…</w:t>
+            </w:r>
+            <w:proofErr w:type="gramEnd"/>
+            <w:r>
+              <w:rPr>
+                <w:rFonts w:cs="Times New Roman"/>
+                <w:b/>
+                <w:bCs/>
+                <w:sz w:val="24"/>
+                <w:szCs w:val="24"/>
+              </w:rPr>
+              <w:t xml:space="preserve">…………………………; </w:t>
+            </w:r>
+            <w:proofErr w:type="spellStart"/>
+            <w:proofErr w:type="gramStart"/>
+            <w:r>
+              <w:rPr>
+                <w:rFonts w:cs="Times New Roman"/>
+                <w:b/>
+                <w:bCs/>
+                <w:sz w:val="24"/>
+                <w:szCs w:val="24"/>
+              </w:rPr>
+              <w:t>Ngày</w:t>
+            </w:r>
+            <w:proofErr w:type="spellEnd"/>
+            <w:r>
+              <w:rPr>
+                <w:rFonts w:cs="Times New Roman"/>
+                <w:b/>
+                <w:bCs/>
+                <w:sz w:val="24"/>
+                <w:szCs w:val="24"/>
+              </w:rPr>
+              <w:t>:…</w:t>
+            </w:r>
+            <w:proofErr w:type="gramEnd"/>
+            <w:r>
+              <w:rPr>
+                <w:rFonts w:cs="Times New Roman"/>
+                <w:b/>
+                <w:bCs/>
+                <w:sz w:val="24"/>
+                <w:szCs w:val="24"/>
+              </w:rPr>
+              <w:t xml:space="preserve">…….; Người </w:t>
+            </w:r>
+            <w:proofErr w:type="spellStart"/>
+            <w:r>
+              <w:rPr>
+                <w:rFonts w:cs="Times New Roman"/>
+                <w:b/>
+                <w:bCs/>
+                <w:sz w:val="24"/>
+                <w:szCs w:val="24"/>
+              </w:rPr>
+              <w:t>cho</w:t>
+            </w:r>
+            <w:proofErr w:type="spellEnd"/>
+            <w:r>
+              <w:rPr>
+                <w:rFonts w:cs="Times New Roman"/>
+                <w:b/>
+                <w:bCs/>
+                <w:sz w:val="24"/>
+                <w:szCs w:val="24"/>
+              </w:rPr>
+              <w:t xml:space="preserve"> </w:t>
+            </w:r>
+            <w:proofErr w:type="spellStart"/>
+            <w:proofErr w:type="gramStart"/>
+            <w:r>
+              <w:rPr>
+                <w:rFonts w:cs="Times New Roman"/>
+                <w:b/>
+                <w:bCs/>
+                <w:sz w:val="24"/>
+                <w:szCs w:val="24"/>
+              </w:rPr>
+              <w:t>phép</w:t>
+            </w:r>
+            <w:proofErr w:type="spellEnd"/>
+            <w:r>
+              <w:rPr>
+                <w:rFonts w:cs="Times New Roman"/>
+                <w:b/>
+                <w:bCs/>
+                <w:sz w:val="24"/>
+                <w:szCs w:val="24"/>
+              </w:rPr>
+              <w:t>:…</w:t>
+            </w:r>
+            <w:proofErr w:type="gramEnd"/>
+            <w:r>
+              <w:rPr>
+                <w:rFonts w:cs="Times New Roman"/>
+                <w:b/>
+                <w:bCs/>
+                <w:sz w:val="24"/>
+                <w:szCs w:val="24"/>
+              </w:rPr>
+              <w:t>……………………</w:t>
+            </w:r>
           </w:p>
         </w:tc>
       </w:tr>
@@ -11266,55 +12047,103 @@
     </w:p>
     <w:tbl>
       <w:tblPr>
-        <w:tblStyle w:val="TableGrid"/>
-        <w:tblpPr w:leftFromText="180" w:rightFromText="180" w:vertAnchor="text" w:horzAnchor="page" w:tblpX="4937" w:tblpY="41"/>
-        <w:tblW w:w="3248" w:type="pct"/>
+        <w:tblW w:w="9600" w:type="dxa"/>
+        <w:jc w:val="center"/>
         <w:tblBorders>
-          <w:top w:val="none" w:sz="0" w:space="0" w:color="auto"/>
-          <w:left w:val="none" w:sz="0" w:space="0" w:color="auto"/>
-          <w:bottom w:val="none" w:sz="0" w:space="0" w:color="auto"/>
-          <w:right w:val="none" w:sz="0" w:space="0" w:color="auto"/>
-          <w:insideH w:val="none" w:sz="0" w:space="0" w:color="auto"/>
-          <w:insideV w:val="none" w:sz="0" w:space="0" w:color="auto"/>
+          <w:top w:val="nil"/>
+          <w:left w:val="nil"/>
+          <w:bottom w:val="nil"/>
+          <w:right w:val="nil"/>
+          <w:insideH w:val="nil"/>
+          <w:insideV w:val="nil"/>
         </w:tblBorders>
+        <w:tblLayout w:type="fixed"/>
+        <w:tblCellMar>
+          <w:left w:w="57" w:type="dxa"/>
+          <w:right w:w="57" w:type="dxa"/>
+        </w:tblCellMar>
         <w:tblLook w:val="04A0" w:firstRow="1" w:lastRow="0" w:firstColumn="1" w:lastColumn="0" w:noHBand="0" w:noVBand="1"/>
       </w:tblPr>
       <w:tblGrid>
-        <w:gridCol w:w="350"/>
-        <w:gridCol w:w="5908"/>
+        <w:gridCol w:w="3250"/>
+        <w:gridCol w:w="600"/>
+        <w:gridCol w:w="5750"/>
       </w:tblGrid>
       <w:tr>
-        <w:tc>
-          <w:tcPr>
-            <w:tcW w:w="280" w:type="pct"/>
+        <w:trPr>
+          <w:cantSplit/>
+          <w:trHeight w:hRule="exact" w:val="510"/>
+          <w:jc w:val="center"/>
+        </w:trPr>
+        <w:tc>
+          <w:tcPr>
+            <w:tcW w:w="3250" w:type="dxa"/>
+            <w:vMerge w:val="restart"/>
+            <w:tcBorders>
+              <w:top w:val="nil"/>
+              <w:left w:val="nil"/>
+              <w:bottom w:val="nil"/>
+              <w:right w:val="nil"/>
+            </w:tcBorders>
+          </w:tcPr>
+          <w:p>
+            <w:pPr>
+              <w:keepNext/>
+              <w:spacing w:after="0" w:line="320" w:lineRule="exact"/>
+              <w:ind w:firstLine="0"/>
+              <w:jc w:val="left"/>
+              <w:rPr>
+                <w:sz w:val="24"/>
+                <w:szCs w:val="24"/>
+                <w:lang w:val="vi-VN"/>
+              </w:rPr>
+            </w:pPr>
+            <w:r>
+              <w:rPr>
+                <w:sz w:val="24"/>
+                <w:szCs w:val="24"/>
+                <w:lang w:val="vi-VN"/>
+              </w:rPr>
+              <w:t>Đơn vị công tác khẳng định:</w:t>
+            </w:r>
+          </w:p>
+        </w:tc>
+        <w:tc>
+          <w:tcPr>
+            <w:tcW w:w="600" w:type="dxa"/>
             <w:tcBorders>
               <w:top w:val="single" w:sz="4" w:space="0" w:color="auto"/>
               <w:left w:val="single" w:sz="4" w:space="0" w:color="auto"/>
               <w:bottom w:val="single" w:sz="4" w:space="0" w:color="auto"/>
               <w:right w:val="single" w:sz="4" w:space="0" w:color="auto"/>
             </w:tcBorders>
-          </w:tcPr>
-          <w:p>
-            <w:pPr>
-              <w:spacing w:before="40" w:after="40" w:line="320" w:lineRule="exact"/>
-              <w:rPr>
-                <w:sz w:val="24"/>
-                <w:szCs w:val="24"/>
-                <w:lang w:val="vi-VN"/>
-              </w:rPr>
-            </w:pPr>
-          </w:p>
-        </w:tc>
-        <w:tc>
-          <w:tcPr>
-            <w:tcW w:w="4720" w:type="pct"/>
-            <w:tcBorders>
-              <w:left w:val="single" w:sz="4" w:space="0" w:color="auto"/>
-            </w:tcBorders>
-          </w:tcPr>
-          <w:p>
-            <w:pPr>
-              <w:spacing w:before="40" w:after="40" w:line="320" w:lineRule="exact"/>
+            <w:vAlign w:val="center"/>
+          </w:tcPr>
+          <w:p>
+            <w:pPr>
+              <w:keepNext/>
+              <w:spacing w:after="0" w:line="320" w:lineRule="exact"/>
+            </w:pPr>
+          </w:p>
+        </w:tc>
+        <w:tc>
+          <w:tcPr>
+            <w:tcW w:w="5750" w:type="dxa"/>
+            <w:tcBorders>
+              <w:top w:val="nil"/>
+              <w:left w:val="nil"/>
+              <w:bottom w:val="nil"/>
+              <w:right w:val="nil"/>
+            </w:tcBorders>
+            <w:tcMar>
+              <w:left w:w="260" w:type="dxa"/>
+            </w:tcMar>
+            <w:vAlign w:val="center"/>
+          </w:tcPr>
+          <w:p>
+            <w:pPr>
+              <w:keepNext/>
+              <w:spacing w:after="0" w:line="320" w:lineRule="exact"/>
               <w:rPr>
                 <w:sz w:val="24"/>
                 <w:szCs w:val="24"/>
@@ -11333,37 +12162,65 @@
         </w:tc>
       </w:tr>
       <w:tr>
-        <w:tc>
-          <w:tcPr>
-            <w:tcW w:w="280" w:type="pct"/>
+        <w:trPr>
+          <w:cantSplit/>
+          <w:trHeight w:hRule="exact" w:val="510"/>
+          <w:jc w:val="center"/>
+        </w:trPr>
+        <w:tc>
+          <w:tcPr>
+            <w:tcW w:w="3250" w:type="dxa"/>
+            <w:vMerge/>
+            <w:tcBorders>
+              <w:top w:val="nil"/>
+              <w:left w:val="nil"/>
+              <w:bottom w:val="nil"/>
+              <w:right w:val="nil"/>
+            </w:tcBorders>
+          </w:tcPr>
+          <w:p>
+            <w:pPr>
+              <w:keepNext/>
+              <w:spacing w:after="0" w:line="320" w:lineRule="exact"/>
+            </w:pPr>
+          </w:p>
+        </w:tc>
+        <w:tc>
+          <w:tcPr>
+            <w:tcW w:w="600" w:type="dxa"/>
             <w:tcBorders>
               <w:top w:val="single" w:sz="4" w:space="0" w:color="auto"/>
               <w:left w:val="single" w:sz="4" w:space="0" w:color="auto"/>
               <w:bottom w:val="single" w:sz="4" w:space="0" w:color="auto"/>
               <w:right w:val="single" w:sz="4" w:space="0" w:color="auto"/>
             </w:tcBorders>
-          </w:tcPr>
-          <w:p>
-            <w:pPr>
-              <w:spacing w:before="40" w:after="40" w:line="320" w:lineRule="exact"/>
-              <w:rPr>
-                <w:sz w:val="24"/>
-                <w:szCs w:val="24"/>
-                <w:lang w:val="vi-VN"/>
-              </w:rPr>
-            </w:pPr>
-          </w:p>
-        </w:tc>
-        <w:tc>
-          <w:tcPr>
-            <w:tcW w:w="4720" w:type="pct"/>
-            <w:tcBorders>
-              <w:left w:val="single" w:sz="4" w:space="0" w:color="auto"/>
-            </w:tcBorders>
-          </w:tcPr>
-          <w:p>
-            <w:pPr>
-              <w:spacing w:before="40" w:after="40" w:line="320" w:lineRule="exact"/>
+            <w:vAlign w:val="center"/>
+          </w:tcPr>
+          <w:p>
+            <w:pPr>
+              <w:keepNext/>
+              <w:spacing w:after="0" w:line="320" w:lineRule="exact"/>
+            </w:pPr>
+          </w:p>
+        </w:tc>
+        <w:tc>
+          <w:tcPr>
+            <w:tcW w:w="5750" w:type="dxa"/>
+            <w:tcBorders>
+              <w:top w:val="nil"/>
+              <w:left w:val="nil"/>
+              <w:bottom w:val="nil"/>
+              <w:right w:val="nil"/>
+            </w:tcBorders>
+            <w:tcMar>
+              <w:left w:w="260" w:type="dxa"/>
+            </w:tcMar>
+            <w:vAlign w:val="center"/>
+          </w:tcPr>
+          <w:p>
+            <w:pPr>
+              <w:keepNext/>
+              <w:spacing w:after="0" w:line="320" w:lineRule="exact"/>
               <w:rPr>
                 <w:sz w:val="24"/>
                 <w:szCs w:val="24"/>
@@ -11382,37 +12239,62 @@
         </w:tc>
       </w:tr>
       <w:tr>
-        <w:tc>
-          <w:tcPr>
-            <w:tcW w:w="280" w:type="pct"/>
+        <w:trPr>
+          <w:cantSplit/>
+          <w:trHeight w:hRule="exact" w:val="510"/>
+          <w:jc w:val="center"/>
+        </w:trPr>
+        <w:tc>
+          <w:tcPr>
+            <w:tcW w:w="3250" w:type="dxa"/>
+            <w:vMerge/>
+            <w:tcBorders>
+              <w:top w:val="nil"/>
+              <w:left w:val="nil"/>
+              <w:bottom w:val="nil"/>
+              <w:right w:val="nil"/>
+            </w:tcBorders>
+          </w:tcPr>
+          <w:p>
+            <w:pPr>
+              <w:spacing w:after="0" w:line="320" w:lineRule="exact"/>
+            </w:pPr>
+          </w:p>
+        </w:tc>
+        <w:tc>
+          <w:tcPr>
+            <w:tcW w:w="600" w:type="dxa"/>
             <w:tcBorders>
               <w:top w:val="single" w:sz="4" w:space="0" w:color="auto"/>
               <w:left w:val="single" w:sz="4" w:space="0" w:color="auto"/>
               <w:bottom w:val="single" w:sz="4" w:space="0" w:color="auto"/>
               <w:right w:val="single" w:sz="4" w:space="0" w:color="auto"/>
             </w:tcBorders>
-          </w:tcPr>
-          <w:p>
-            <w:pPr>
-              <w:spacing w:before="40" w:after="40" w:line="320" w:lineRule="exact"/>
-              <w:rPr>
-                <w:sz w:val="24"/>
-                <w:szCs w:val="24"/>
-                <w:lang w:val="vi-VN"/>
-              </w:rPr>
-            </w:pPr>
-          </w:p>
-        </w:tc>
-        <w:tc>
-          <w:tcPr>
-            <w:tcW w:w="4720" w:type="pct"/>
-            <w:tcBorders>
-              <w:left w:val="single" w:sz="4" w:space="0" w:color="auto"/>
-            </w:tcBorders>
-          </w:tcPr>
-          <w:p>
-            <w:pPr>
-              <w:spacing w:before="40" w:after="40" w:line="320" w:lineRule="exact"/>
+            <w:vAlign w:val="center"/>
+          </w:tcPr>
+          <w:p>
+            <w:pPr>
+              <w:spacing w:after="0" w:line="320" w:lineRule="exact"/>
+            </w:pPr>
+          </w:p>
+        </w:tc>
+        <w:tc>
+          <w:tcPr>
+            <w:tcW w:w="5750" w:type="dxa"/>
+            <w:tcBorders>
+              <w:top w:val="nil"/>
+              <w:left w:val="nil"/>
+              <w:bottom w:val="nil"/>
+              <w:right w:val="nil"/>
+            </w:tcBorders>
+            <w:tcMar>
+              <w:left w:w="260" w:type="dxa"/>
+            </w:tcMar>
+            <w:vAlign w:val="center"/>
+          </w:tcPr>
+          <w:p>
+            <w:pPr>
+              <w:spacing w:after="0" w:line="320" w:lineRule="exact"/>
               <w:rPr>
                 <w:sz w:val="24"/>
                 <w:szCs w:val="24"/>
@@ -11439,27 +12321,6 @@
         <w:rPr>
           <w:sz w:val="24"/>
           <w:szCs w:val="24"/>
-          <w:lang w:val="vi-VN"/>
-        </w:rPr>
-      </w:pPr>
-      <w:r>
-        <w:rPr>
-          <w:sz w:val="24"/>
-          <w:szCs w:val="24"/>
-          <w:lang w:val="vi-VN"/>
-        </w:rPr>
-        <w:t>Đơn vị công tác khẳng định:</w:t>
-      </w:r>
-    </w:p>
-    <w:p>
-      <w:pPr>
-        <w:spacing w:before="40" w:after="40" w:line="320" w:lineRule="exact"/>
-        <w:ind w:firstLine="0"/>
-        <w:jc w:val="left"/>
-        <w:rPr>
-          <w:sz w:val="24"/>
-          <w:szCs w:val="24"/>
-          <w:lang w:val="vi-VN"/>
         </w:rPr>
       </w:pPr>
     </w:p>
@@ -11471,31 +12332,6 @@
         <w:rPr>
           <w:sz w:val="24"/>
           <w:szCs w:val="24"/>
-          <w:lang w:val="vi-VN"/>
-        </w:rPr>
-      </w:pPr>
-    </w:p>
-    <w:p>
-      <w:pPr>
-        <w:spacing w:before="40" w:after="40" w:line="320" w:lineRule="exact"/>
-        <w:ind w:firstLine="0"/>
-        <w:jc w:val="left"/>
-        <w:rPr>
-          <w:sz w:val="24"/>
-          <w:szCs w:val="24"/>
-          <w:lang w:val="vi-VN"/>
-        </w:rPr>
-      </w:pPr>
-    </w:p>
-    <w:p>
-      <w:pPr>
-        <w:spacing w:before="40" w:after="40" w:line="320" w:lineRule="exact"/>
-        <w:ind w:firstLine="0"/>
-        <w:jc w:val="left"/>
-        <w:rPr>
-          <w:sz w:val="24"/>
-          <w:szCs w:val="24"/>
-          <w:lang w:val="vi-VN"/>
         </w:rPr>
       </w:pPr>
       <w:r>
@@ -11525,55 +12361,102 @@
     </w:p>
     <w:tbl>
       <w:tblPr>
-        <w:tblStyle w:val="TableGrid"/>
-        <w:tblpPr w:leftFromText="180" w:rightFromText="180" w:vertAnchor="text" w:horzAnchor="page" w:tblpX="4937" w:tblpY="28"/>
-        <w:tblW w:w="0" w:type="auto"/>
+        <w:tblW w:w="9600" w:type="dxa"/>
+        <w:jc w:val="center"/>
         <w:tblBorders>
-          <w:top w:val="none" w:sz="0" w:space="0" w:color="auto"/>
-          <w:left w:val="none" w:sz="0" w:space="0" w:color="auto"/>
-          <w:bottom w:val="none" w:sz="0" w:space="0" w:color="auto"/>
-          <w:right w:val="none" w:sz="0" w:space="0" w:color="auto"/>
-          <w:insideH w:val="none" w:sz="0" w:space="0" w:color="auto"/>
-          <w:insideV w:val="none" w:sz="0" w:space="0" w:color="auto"/>
+          <w:top w:val="nil"/>
+          <w:left w:val="nil"/>
+          <w:bottom w:val="nil"/>
+          <w:right w:val="nil"/>
+          <w:insideH w:val="nil"/>
+          <w:insideV w:val="nil"/>
         </w:tblBorders>
+        <w:tblLayout w:type="fixed"/>
+        <w:tblCellMar>
+          <w:left w:w="57" w:type="dxa"/>
+          <w:right w:w="57" w:type="dxa"/>
+        </w:tblCellMar>
         <w:tblLook w:val="04A0" w:firstRow="1" w:lastRow="0" w:firstColumn="1" w:lastColumn="0" w:noHBand="0" w:noVBand="1"/>
       </w:tblPr>
       <w:tblGrid>
-        <w:gridCol w:w="340"/>
-        <w:gridCol w:w="5892"/>
+        <w:gridCol w:w="3250"/>
+        <w:gridCol w:w="600"/>
+        <w:gridCol w:w="5750"/>
       </w:tblGrid>
       <w:tr>
-        <w:tc>
-          <w:tcPr>
-            <w:tcW w:w="340" w:type="dxa"/>
+        <w:trPr>
+          <w:cantSplit/>
+          <w:trHeight w:hRule="exact" w:val="510"/>
+          <w:jc w:val="center"/>
+        </w:trPr>
+        <w:tc>
+          <w:tcPr>
+            <w:tcW w:w="3250" w:type="dxa"/>
+            <w:vMerge w:val="restart"/>
+            <w:tcBorders>
+              <w:top w:val="nil"/>
+              <w:left w:val="nil"/>
+              <w:bottom w:val="nil"/>
+              <w:right w:val="nil"/>
+            </w:tcBorders>
+          </w:tcPr>
+          <w:p>
+            <w:pPr>
+              <w:keepNext/>
+              <w:spacing w:after="0" w:line="320" w:lineRule="exact"/>
+              <w:ind w:firstLine="0"/>
+              <w:jc w:val="left"/>
+              <w:rPr>
+                <w:sz w:val="24"/>
+                <w:szCs w:val="24"/>
+              </w:rPr>
+            </w:pPr>
+            <w:r>
+              <w:rPr>
+                <w:sz w:val="24"/>
+                <w:szCs w:val="24"/>
+                <w:lang w:val="vi-VN"/>
+              </w:rPr>
+              <w:t>Đơn vị vận hành khẳng định:</w:t>
+            </w:r>
+          </w:p>
+        </w:tc>
+        <w:tc>
+          <w:tcPr>
+            <w:tcW w:w="600" w:type="dxa"/>
             <w:tcBorders>
               <w:top w:val="single" w:sz="4" w:space="0" w:color="auto"/>
               <w:left w:val="single" w:sz="4" w:space="0" w:color="auto"/>
               <w:bottom w:val="single" w:sz="4" w:space="0" w:color="auto"/>
               <w:right w:val="single" w:sz="4" w:space="0" w:color="auto"/>
             </w:tcBorders>
-          </w:tcPr>
-          <w:p>
-            <w:pPr>
-              <w:spacing w:before="40" w:after="40" w:line="320" w:lineRule="exact"/>
-              <w:rPr>
-                <w:sz w:val="24"/>
-                <w:szCs w:val="24"/>
-                <w:lang w:val="vi-VN"/>
-              </w:rPr>
-            </w:pPr>
-          </w:p>
-        </w:tc>
-        <w:tc>
-          <w:tcPr>
-            <w:tcW w:w="5892" w:type="dxa"/>
-            <w:tcBorders>
-              <w:left w:val="single" w:sz="4" w:space="0" w:color="auto"/>
-            </w:tcBorders>
-          </w:tcPr>
-          <w:p>
-            <w:pPr>
-              <w:spacing w:before="40" w:after="40" w:line="320" w:lineRule="exact"/>
+            <w:vAlign w:val="center"/>
+          </w:tcPr>
+          <w:p>
+            <w:pPr>
+              <w:keepNext/>
+              <w:spacing w:after="0" w:line="320" w:lineRule="exact"/>
+            </w:pPr>
+          </w:p>
+        </w:tc>
+        <w:tc>
+          <w:tcPr>
+            <w:tcW w:w="5750" w:type="dxa"/>
+            <w:tcBorders>
+              <w:top w:val="nil"/>
+              <w:left w:val="nil"/>
+              <w:bottom w:val="nil"/>
+              <w:right w:val="nil"/>
+            </w:tcBorders>
+            <w:tcMar>
+              <w:left w:w="260" w:type="dxa"/>
+            </w:tcMar>
+            <w:vAlign w:val="center"/>
+          </w:tcPr>
+          <w:p>
+            <w:pPr>
+              <w:keepNext/>
+              <w:spacing w:after="0" w:line="320" w:lineRule="exact"/>
               <w:rPr>
                 <w:sz w:val="24"/>
                 <w:szCs w:val="24"/>
@@ -11592,37 +12475,65 @@
         </w:tc>
       </w:tr>
       <w:tr>
-        <w:tc>
-          <w:tcPr>
-            <w:tcW w:w="340" w:type="dxa"/>
+        <w:trPr>
+          <w:cantSplit/>
+          <w:trHeight w:hRule="exact" w:val="510"/>
+          <w:jc w:val="center"/>
+        </w:trPr>
+        <w:tc>
+          <w:tcPr>
+            <w:tcW w:w="3250" w:type="dxa"/>
+            <w:vMerge/>
+            <w:tcBorders>
+              <w:top w:val="nil"/>
+              <w:left w:val="nil"/>
+              <w:bottom w:val="nil"/>
+              <w:right w:val="nil"/>
+            </w:tcBorders>
+          </w:tcPr>
+          <w:p>
+            <w:pPr>
+              <w:keepNext/>
+              <w:spacing w:after="0" w:line="320" w:lineRule="exact"/>
+            </w:pPr>
+          </w:p>
+        </w:tc>
+        <w:tc>
+          <w:tcPr>
+            <w:tcW w:w="600" w:type="dxa"/>
             <w:tcBorders>
               <w:top w:val="single" w:sz="4" w:space="0" w:color="auto"/>
               <w:left w:val="single" w:sz="4" w:space="0" w:color="auto"/>
               <w:bottom w:val="single" w:sz="4" w:space="0" w:color="auto"/>
               <w:right w:val="single" w:sz="4" w:space="0" w:color="auto"/>
             </w:tcBorders>
-          </w:tcPr>
-          <w:p>
-            <w:pPr>
-              <w:spacing w:before="40" w:after="40" w:line="320" w:lineRule="exact"/>
-              <w:rPr>
-                <w:sz w:val="24"/>
-                <w:szCs w:val="24"/>
-                <w:lang w:val="vi-VN"/>
-              </w:rPr>
-            </w:pPr>
-          </w:p>
-        </w:tc>
-        <w:tc>
-          <w:tcPr>
-            <w:tcW w:w="5892" w:type="dxa"/>
-            <w:tcBorders>
-              <w:left w:val="single" w:sz="4" w:space="0" w:color="auto"/>
-            </w:tcBorders>
-          </w:tcPr>
-          <w:p>
-            <w:pPr>
-              <w:spacing w:before="40" w:after="40" w:line="320" w:lineRule="exact"/>
+            <w:vAlign w:val="center"/>
+          </w:tcPr>
+          <w:p>
+            <w:pPr>
+              <w:keepNext/>
+              <w:spacing w:after="0" w:line="320" w:lineRule="exact"/>
+            </w:pPr>
+          </w:p>
+        </w:tc>
+        <w:tc>
+          <w:tcPr>
+            <w:tcW w:w="5750" w:type="dxa"/>
+            <w:tcBorders>
+              <w:top w:val="nil"/>
+              <w:left w:val="nil"/>
+              <w:bottom w:val="nil"/>
+              <w:right w:val="nil"/>
+            </w:tcBorders>
+            <w:tcMar>
+              <w:left w:w="260" w:type="dxa"/>
+            </w:tcMar>
+            <w:vAlign w:val="center"/>
+          </w:tcPr>
+          <w:p>
+            <w:pPr>
+              <w:keepNext/>
+              <w:spacing w:after="0" w:line="320" w:lineRule="exact"/>
               <w:rPr>
                 <w:sz w:val="24"/>
                 <w:szCs w:val="24"/>
@@ -11641,37 +12552,62 @@
         </w:tc>
       </w:tr>
       <w:tr>
-        <w:tc>
-          <w:tcPr>
-            <w:tcW w:w="340" w:type="dxa"/>
+        <w:trPr>
+          <w:cantSplit/>
+          <w:trHeight w:hRule="exact" w:val="510"/>
+          <w:jc w:val="center"/>
+        </w:trPr>
+        <w:tc>
+          <w:tcPr>
+            <w:tcW w:w="3250" w:type="dxa"/>
+            <w:vMerge/>
+            <w:tcBorders>
+              <w:top w:val="nil"/>
+              <w:left w:val="nil"/>
+              <w:bottom w:val="nil"/>
+              <w:right w:val="nil"/>
+            </w:tcBorders>
+          </w:tcPr>
+          <w:p>
+            <w:pPr>
+              <w:spacing w:after="0" w:line="320" w:lineRule="exact"/>
+            </w:pPr>
+          </w:p>
+        </w:tc>
+        <w:tc>
+          <w:tcPr>
+            <w:tcW w:w="600" w:type="dxa"/>
             <w:tcBorders>
               <w:top w:val="single" w:sz="4" w:space="0" w:color="auto"/>
               <w:left w:val="single" w:sz="4" w:space="0" w:color="auto"/>
               <w:bottom w:val="single" w:sz="4" w:space="0" w:color="auto"/>
               <w:right w:val="single" w:sz="4" w:space="0" w:color="auto"/>
             </w:tcBorders>
-          </w:tcPr>
-          <w:p>
-            <w:pPr>
-              <w:spacing w:before="40" w:after="40" w:line="320" w:lineRule="exact"/>
-              <w:rPr>
-                <w:sz w:val="24"/>
-                <w:szCs w:val="24"/>
-                <w:lang w:val="vi-VN"/>
-              </w:rPr>
-            </w:pPr>
-          </w:p>
-        </w:tc>
-        <w:tc>
-          <w:tcPr>
-            <w:tcW w:w="5892" w:type="dxa"/>
-            <w:tcBorders>
-              <w:left w:val="single" w:sz="4" w:space="0" w:color="auto"/>
-            </w:tcBorders>
-          </w:tcPr>
-          <w:p>
-            <w:pPr>
-              <w:spacing w:before="40" w:after="40" w:line="320" w:lineRule="exact"/>
+            <w:vAlign w:val="center"/>
+          </w:tcPr>
+          <w:p>
+            <w:pPr>
+              <w:spacing w:after="0" w:line="320" w:lineRule="exact"/>
+            </w:pPr>
+          </w:p>
+        </w:tc>
+        <w:tc>
+          <w:tcPr>
+            <w:tcW w:w="5750" w:type="dxa"/>
+            <w:tcBorders>
+              <w:top w:val="nil"/>
+              <w:left w:val="nil"/>
+              <w:bottom w:val="nil"/>
+              <w:right w:val="nil"/>
+            </w:tcBorders>
+            <w:tcMar>
+              <w:left w:w="260" w:type="dxa"/>
+            </w:tcMar>
+            <w:vAlign w:val="center"/>
+          </w:tcPr>
+          <w:p>
+            <w:pPr>
+              <w:spacing w:after="0" w:line="320" w:lineRule="exact"/>
               <w:rPr>
                 <w:sz w:val="24"/>
                 <w:szCs w:val="24"/>
@@ -11690,62 +12626,6 @@
         </w:tc>
       </w:tr>
     </w:tbl>
-    <w:p>
-      <w:pPr>
-        <w:spacing w:before="40" w:after="40" w:line="320" w:lineRule="exact"/>
-        <w:ind w:firstLine="0"/>
-        <w:jc w:val="left"/>
-        <w:rPr>
-          <w:sz w:val="24"/>
-          <w:szCs w:val="24"/>
-          <w:lang w:val="vi-VN"/>
-        </w:rPr>
-      </w:pPr>
-      <w:r>
-        <w:rPr>
-          <w:sz w:val="24"/>
-          <w:szCs w:val="24"/>
-          <w:lang w:val="vi-VN"/>
-        </w:rPr>
-        <w:t>Đơn vị vận hành khẳng định:</w:t>
-      </w:r>
-    </w:p>
-    <w:p>
-      <w:pPr>
-        <w:spacing w:before="40" w:after="40" w:line="320" w:lineRule="exact"/>
-        <w:ind w:firstLine="0"/>
-        <w:jc w:val="left"/>
-        <w:rPr>
-          <w:sz w:val="24"/>
-          <w:szCs w:val="24"/>
-          <w:lang w:val="vi-VN"/>
-        </w:rPr>
-      </w:pPr>
-    </w:p>
-    <w:p>
-      <w:pPr>
-        <w:spacing w:before="40" w:after="40" w:line="320" w:lineRule="exact"/>
-        <w:ind w:firstLine="0"/>
-        <w:jc w:val="left"/>
-        <w:rPr>
-          <w:sz w:val="24"/>
-          <w:szCs w:val="24"/>
-          <w:lang w:val="vi-VN"/>
-        </w:rPr>
-      </w:pPr>
-    </w:p>
-    <w:p>
-      <w:pPr>
-        <w:spacing w:before="40" w:after="40" w:line="320" w:lineRule="exact"/>
-        <w:ind w:firstLine="0"/>
-        <w:jc w:val="left"/>
-        <w:rPr>
-          <w:sz w:val="24"/>
-          <w:szCs w:val="24"/>
-          <w:lang w:val="vi-VN"/>
-        </w:rPr>
-      </w:pPr>
-    </w:p>
     <w:p>
       <w:pPr>
         <w:spacing w:before="40" w:after="40" w:line="320" w:lineRule="exact"/>

</xml_diff>

<commit_message>
fix(work-permits): dieu chinh thong tin tren ban in PCT
</commit_message>
<xml_diff>
--- a/templates/work-permit-mechanical.docx
+++ b/templates/work-permit-mechanical.docx
@@ -3051,12 +3051,12 @@
     </w:tbl>
     <w:p>
       <w:pPr>
-        <w:spacing w:before="240" w:after="40" w:line="320" w:lineRule="exact"/>
+        <w:spacing w:before="40" w:after="40" w:line="320" w:lineRule="exact"/>
         <w:ind w:left="-284" w:firstLine="0"/>
         <w:jc w:val="left"/>
         <w:rPr>
-          <w:sz w:val="24"/>
-          <w:szCs w:val="24"/>
+          <w:sz w:val="22"/>
+          <w:szCs w:val="22"/>
         </w:rPr>
       </w:pPr>
       <w:r>
@@ -3065,7 +3065,14 @@
           <w:szCs w:val="24"/>
           <w:lang w:val="vi-VN"/>
         </w:rPr>
-        <w:t>Người cho phép: …………</w:t>
+        <w:t>Người cho phép: ……………</w:t>
+      </w:r>
+      <w:r>
+        <w:rPr>
+          <w:sz w:val="24"/>
+          <w:szCs w:val="24"/>
+        </w:rPr>
+        <w:t>……….</w:t>
       </w:r>
       <w:r>
         <w:rPr>
@@ -3073,82 +3080,7 @@
           <w:szCs w:val="24"/>
           <w:lang w:val="vi-VN"/>
         </w:rPr>
-        <w:t>..…</w:t>
-      </w:r>
-      <w:r>
-        <w:rPr>
-          <w:sz w:val="24"/>
-          <w:szCs w:val="24"/>
-        </w:rPr>
-        <w:t>.</w:t>
-      </w:r>
-      <w:r>
-        <w:rPr>
-          <w:sz w:val="24"/>
-          <w:szCs w:val="24"/>
-        </w:rPr>
-        <w:t>.</w:t>
-      </w:r>
-      <w:r>
-        <w:rPr>
-          <w:sz w:val="24"/>
-          <w:szCs w:val="24"/>
-          <w:lang w:val="vi-VN"/>
-        </w:rPr>
-        <w:t>Chữ ký ……………. Ngày</w:t>
-      </w:r>
-      <w:r>
-        <w:rPr>
-          <w:sz w:val="24"/>
-          <w:szCs w:val="24"/>
-        </w:rPr>
-        <w:t>: {{</w:t>
-      </w:r>
-      <w:proofErr w:type="spellStart"/>
-      <w:r>
-        <w:rPr>
-          <w:sz w:val="24"/>
-          <w:szCs w:val="24"/>
-        </w:rPr>
-        <w:t>dateCurrent</w:t>
-      </w:r>
-      <w:proofErr w:type="spellEnd"/>
-      <w:r>
-        <w:rPr>
-          <w:sz w:val="24"/>
-          <w:szCs w:val="24"/>
-        </w:rPr>
-        <w:t xml:space="preserve">}}. </w:t>
-      </w:r>
-      <w:r>
-        <w:rPr>
-          <w:sz w:val="24"/>
-          <w:szCs w:val="24"/>
-          <w:lang w:val="vi-VN"/>
-        </w:rPr>
-        <w:t>Giờ ……</w:t>
-      </w:r>
-      <w:r>
-        <w:rPr>
-          <w:sz w:val="24"/>
-          <w:szCs w:val="24"/>
-        </w:rPr>
-        <w:t>h</w:t>
-      </w:r>
-      <w:r>
-        <w:rPr>
-          <w:sz w:val="24"/>
-          <w:szCs w:val="24"/>
-          <w:lang w:val="vi-VN"/>
-        </w:rPr>
-        <w:t>…..</w:t>
-      </w:r>
-      <w:r>
-        <w:rPr>
-          <w:sz w:val="24"/>
-          <w:szCs w:val="24"/>
-        </w:rPr>
-        <w:t>.</w:t>
+        <w:t>Chữ ký ………… Ngày……\……\…… Giờ …….h…...</w:t>
       </w:r>
     </w:p>
     <w:p>
@@ -3175,20 +3107,12 @@
           <w:szCs w:val="24"/>
           <w:lang w:val="vi-VN"/>
         </w:rPr>
-        <w:t>…………</w:t>
+        <w:t>……………</w:t>
       </w:r>
       <w:r>
         <w:rPr>
           <w:sz w:val="24"/>
           <w:szCs w:val="24"/>
-        </w:rPr>
-        <w:t>...</w:t>
-      </w:r>
-      <w:r>
-        <w:rPr>
-          <w:sz w:val="24"/>
-          <w:szCs w:val="24"/>
-          <w:lang w:val="vi-VN"/>
         </w:rPr>
         <w:t>…</w:t>
       </w:r>
@@ -3197,7 +3121,7 @@
           <w:sz w:val="24"/>
           <w:szCs w:val="24"/>
         </w:rPr>
-        <w:t>….</w:t>
+        <w:t>………..</w:t>
       </w:r>
       <w:r>
         <w:rPr>
@@ -3205,75 +3129,7 @@
           <w:szCs w:val="24"/>
           <w:lang w:val="vi-VN"/>
         </w:rPr>
-        <w:t>Chữ ký …………</w:t>
-      </w:r>
-      <w:r>
-        <w:rPr>
-          <w:sz w:val="24"/>
-          <w:szCs w:val="24"/>
-        </w:rPr>
-        <w:t xml:space="preserve">…. </w:t>
-      </w:r>
-      <w:r>
-        <w:rPr>
-          <w:sz w:val="24"/>
-          <w:szCs w:val="24"/>
-          <w:lang w:val="vi-VN"/>
-        </w:rPr>
-        <w:t>Ngày</w:t>
-      </w:r>
-      <w:r>
-        <w:rPr>
-          <w:sz w:val="24"/>
-          <w:szCs w:val="24"/>
-        </w:rPr>
-        <w:t>: {{</w:t>
-      </w:r>
-      <w:proofErr w:type="spellStart"/>
-      <w:r>
-        <w:rPr>
-          <w:sz w:val="24"/>
-          <w:szCs w:val="24"/>
-        </w:rPr>
-        <w:t>dateCurrent</w:t>
-      </w:r>
-      <w:proofErr w:type="spellEnd"/>
-      <w:r>
-        <w:rPr>
-          <w:sz w:val="24"/>
-          <w:szCs w:val="24"/>
-        </w:rPr>
-        <w:t xml:space="preserve">}}. </w:t>
-      </w:r>
-      <w:r>
-        <w:rPr>
-          <w:sz w:val="24"/>
-          <w:szCs w:val="24"/>
-          <w:lang w:val="vi-VN"/>
-        </w:rPr>
-        <w:t>Giờ ……</w:t>
-      </w:r>
-      <w:r>
-        <w:rPr>
-          <w:sz w:val="24"/>
-          <w:szCs w:val="24"/>
-        </w:rPr>
-        <w:t>h</w:t>
-      </w:r>
-      <w:r>
-        <w:rPr>
-          <w:sz w:val="24"/>
-          <w:szCs w:val="24"/>
-          <w:lang w:val="vi-VN"/>
-        </w:rPr>
-        <w:t>…</w:t>
-      </w:r>
-      <w:r>
-        <w:rPr>
-          <w:sz w:val="24"/>
-          <w:szCs w:val="24"/>
-        </w:rPr>
-        <w:t>...</w:t>
+        <w:t>Chữ ký …………Ngày……\……\…… Giờ …….h…...</w:t>
       </w:r>
     </w:p>
     <w:p>

</xml_diff>